<commit_message>
Confirm LinkedIn Insight Tag + A/B testing at Level Agency, update Wpromote resume
Josh confirmed hands-on LinkedIn Insight Tag installation at Level Agency,
plus an A/B testing strategy that tested hook/offer variants rather than
just messaging. Added to master-profile.md as a permanent fact and used it
to close the "pixel implementation" partial-credit item on the Wpromote Ad
Operations Manager resume/match report. Score moves 46 -> 48, still Long
shot (CM360, DSP tag/macro setup, and verification vendors remain real
gaps).

Co-Authored-By: Claude Sonnet 5 <noreply@anthropic.com>
Claude-Session: https://claude.ai/code/session_011sfw22QbmBTbdWEwpiEusq
</commit_message>
<xml_diff>
--- a/applications/wpromote-ad-operations-manager-b2b/resume.docx
+++ b/applications/wpromote-ad-operations-manager-b2b/resume.docx
@@ -80,7 +80,7 @@
           <w:i w:val="0"/>
           <w:color w:val="1A1A1A"/>
         </w:rPr>
-        <w:t>Marketing operations professional with 15+ years across agency and B2B SaaS environments, including hands-on Google Tag Manager implementation, GA4 conversion tracking, and pixel setup across Meta and Google Ads. Builds and audits the tracking-to-CRM handoff directly, architecting GoHighLevel, HubSpot, and Salesforce systems that receive and route lead data from paid campaigns, the same measurement chain a B2B advertiser depends on from ad click to CRM. Manages Google Ads campaigns end to end, reports performance against CTR, conversion rate, and cost-per-lead, and has served as the technical point of contact between media, analytics, and client teams on tagging, tracking, and QA.</w:t>
+        <w:t>Marketing operations professional with 15+ years across agency and B2B SaaS environments, including hands-on Google Tag Manager implementation, GA4 conversion tracking, and pixel setup across LinkedIn, Meta, and Google Ads. Builds and audits the tracking-to-CRM handoff directly, architecting GoHighLevel, HubSpot, and Salesforce systems that receive and route lead data from paid campaigns, the same measurement chain a B2B advertiser depends on from ad click to CRM. Manages Google Ads campaigns end to end, reports performance against CTR, conversion rate, and cost-per-lead, and has served as the technical point of contact between media, analytics, and client teams on tagging, tracking, and QA.</w:t>
       </w:r>
     </w:p>
     <w:p>
@@ -352,6 +352,30 @@
           <w:sz w:val="18"/>
         </w:rPr>
         <w:t>Remote</w:t>
+      </w:r>
+    </w:p>
+    <w:p>
+      <w:pPr>
+        <w:spacing w:after="30"/>
+        <w:ind w:left="259" w:hanging="259"/>
+      </w:pPr>
+      <w:r>
+        <w:rPr>
+          <w:rFonts w:ascii="Calibri" w:hAnsi="Calibri"/>
+          <w:b w:val="0"/>
+          <w:i w:val="0"/>
+          <w:color w:val="163A5F"/>
+        </w:rPr>
+        <w:t xml:space="preserve">•  </w:t>
+      </w:r>
+      <w:r>
+        <w:rPr>
+          <w:rFonts w:ascii="Calibri" w:hAnsi="Calibri"/>
+          <w:b w:val="0"/>
+          <w:i w:val="0"/>
+          <w:color w:val="1A1A1A"/>
+        </w:rPr>
+        <w:t>Installed the LinkedIn Insight Tag for conversion tracking and ran an A/B testing strategy across paid social that tested hook and offer variants, not just messaging, to identify what actually drove conversions.</w:t>
       </w:r>
     </w:p>
     <w:p>
@@ -993,7 +1017,7 @@
           <w:i w:val="0"/>
           <w:color w:val="1A1A1A"/>
         </w:rPr>
-        <w:t>Google Tag Manager, GA4 Event &amp; Conversion Tracking, UTM Governance, Pixel Implementation (Meta, Google Ads), Technical SEO &amp; Schema Markup</w:t>
+        <w:t>Google Tag Manager, GA4 Event &amp; Conversion Tracking, UTM Governance, Pixel Implementation (LinkedIn Insight Tag, Meta, Google Ads), Technical SEO &amp; Schema Markup</w:t>
       </w:r>
     </w:p>
     <w:p>

</xml_diff>